<commit_message>
Fix the home page and remove the poster component
</commit_message>
<xml_diff>
--- a/chihill-frontend_TECHNICAL_DOCUMENTATION.docx
+++ b/chihill-frontend_TECHNICAL_DOCUMENTATION.docx
@@ -10,8 +10,10 @@
           <w:rFonts w:ascii="Times New Roman" w:hAnsi="Times New Roman" w:cs="Times New Roman"/>
           <w:b/>
           <w:bCs/>
+          <w:color w:val="000000" w:themeColor="text1"/>
           <w:sz w:val="40"/>
           <w:szCs w:val="40"/>
+          <w:u w:val="single"/>
         </w:rPr>
       </w:pPr>
       <w:bookmarkStart w:id="0" w:name="Xed1874880c86f1dc2f6fd81d8d379d1778e04ae"/>
@@ -20,43 +22,55 @@
           <w:rFonts w:ascii="Times New Roman" w:hAnsi="Times New Roman" w:cs="Times New Roman"/>
           <w:b/>
           <w:bCs/>
+          <w:color w:val="000000" w:themeColor="text1"/>
           <w:sz w:val="40"/>
           <w:szCs w:val="40"/>
-        </w:rPr>
-        <w:t xml:space="preserve">CHIHILI </w:t>
-      </w:r>
+          <w:u w:val="single"/>
+        </w:rPr>
+        <w:t>CHIHILI Frontend - Technical Documentation</w:t>
+      </w:r>
+    </w:p>
+    <w:p>
+      <w:pPr>
+        <w:pStyle w:val="FirstParagraph"/>
+        <w:spacing w:line="276" w:lineRule="auto"/>
+        <w:rPr>
+          <w:rFonts w:ascii="Times New Roman" w:hAnsi="Times New Roman" w:cs="Times New Roman"/>
+        </w:rPr>
+      </w:pPr>
       <w:r>
         <w:rPr>
           <w:rFonts w:ascii="Times New Roman" w:hAnsi="Times New Roman" w:cs="Times New Roman"/>
           <w:b/>
           <w:bCs/>
-          <w:sz w:val="40"/>
-          <w:szCs w:val="40"/>
-        </w:rPr>
-        <w:t>Frontend - Technical Documentation</w:t>
-      </w:r>
-    </w:p>
-    <w:p>
-      <w:pPr>
-        <w:pStyle w:val="FirstParagraph"/>
-        <w:spacing w:line="276" w:lineRule="auto"/>
-        <w:rPr>
-          <w:rFonts w:ascii="Times New Roman" w:hAnsi="Times New Roman" w:cs="Times New Roman"/>
-        </w:rPr>
-      </w:pPr>
+        </w:rPr>
+        <w:t>Version:</w:t>
+      </w:r>
+      <w:r>
+        <w:rPr>
+          <w:rFonts w:ascii="Times New Roman" w:hAnsi="Times New Roman" w:cs="Times New Roman"/>
+        </w:rPr>
+        <w:t xml:space="preserve"> 0.1.0</w:t>
+      </w:r>
+      <w:r>
+        <w:rPr>
+          <w:rFonts w:ascii="Times New Roman" w:hAnsi="Times New Roman" w:cs="Times New Roman"/>
+        </w:rPr>
+        <w:br/>
+      </w:r>
       <w:r>
         <w:rPr>
           <w:rFonts w:ascii="Times New Roman" w:hAnsi="Times New Roman" w:cs="Times New Roman"/>
           <w:b/>
           <w:bCs/>
         </w:rPr>
-        <w:t>Version:</w:t>
-      </w:r>
-      <w:r>
-        <w:rPr>
-          <w:rFonts w:ascii="Times New Roman" w:hAnsi="Times New Roman" w:cs="Times New Roman"/>
-        </w:rPr>
-        <w:t xml:space="preserve"> 0.1.0</w:t>
+        <w:t>Last Updated:</w:t>
+      </w:r>
+      <w:r>
+        <w:rPr>
+          <w:rFonts w:ascii="Times New Roman" w:hAnsi="Times New Roman" w:cs="Times New Roman"/>
+        </w:rPr>
+        <w:t xml:space="preserve"> October 17, 2025</w:t>
       </w:r>
       <w:r>
         <w:rPr>
@@ -70,13 +84,13 @@
           <w:b/>
           <w:bCs/>
         </w:rPr>
-        <w:t>Last Updated:</w:t>
-      </w:r>
-      <w:r>
-        <w:rPr>
-          <w:rFonts w:ascii="Times New Roman" w:hAnsi="Times New Roman" w:cs="Times New Roman"/>
-        </w:rPr>
-        <w:t xml:space="preserve"> October 17, 2025</w:t>
+        <w:t>Framework:</w:t>
+      </w:r>
+      <w:r>
+        <w:rPr>
+          <w:rFonts w:ascii="Times New Roman" w:hAnsi="Times New Roman" w:cs="Times New Roman"/>
+        </w:rPr>
+        <w:t xml:space="preserve"> Next.js 15.4.6 with React 19</w:t>
       </w:r>
       <w:r>
         <w:rPr>
@@ -90,26 +104,6 @@
           <w:b/>
           <w:bCs/>
         </w:rPr>
-        <w:t>Framework:</w:t>
-      </w:r>
-      <w:r>
-        <w:rPr>
-          <w:rFonts w:ascii="Times New Roman" w:hAnsi="Times New Roman" w:cs="Times New Roman"/>
-        </w:rPr>
-        <w:t xml:space="preserve"> Next.js 15.4.6 with React 19</w:t>
-      </w:r>
-      <w:r>
-        <w:rPr>
-          <w:rFonts w:ascii="Times New Roman" w:hAnsi="Times New Roman" w:cs="Times New Roman"/>
-        </w:rPr>
-        <w:br/>
-      </w:r>
-      <w:r>
-        <w:rPr>
-          <w:rFonts w:ascii="Times New Roman" w:hAnsi="Times New Roman" w:cs="Times New Roman"/>
-          <w:b/>
-          <w:bCs/>
-        </w:rPr>
         <w:t>Language:</w:t>
       </w:r>
       <w:r>
@@ -131,7 +125,7 @@
           <w:rFonts w:ascii="Times New Roman" w:hAnsi="Times New Roman" w:cs="Times New Roman"/>
           <w:noProof/>
         </w:rPr>
-        <w:pict w14:anchorId="4C6B64D9">
+        <w:pict w14:anchorId="536154BD">
           <v:rect id="_x0000_i1083" alt="" style="width:468pt;height:.05pt;mso-width-percent:0;mso-height-percent:0;mso-width-percent:0;mso-height-percent:0" o:hralign="center" o:hrstd="t" o:hr="t"/>
         </w:pict>
       </w:r>
@@ -909,7 +903,7 @@
           <w:rFonts w:ascii="Times New Roman" w:hAnsi="Times New Roman" w:cs="Times New Roman"/>
           <w:noProof/>
         </w:rPr>
-        <w:pict w14:anchorId="7859D412">
+        <w:pict w14:anchorId="71B804AB">
           <v:rect id="_x0000_i1082" alt="" style="width:468pt;height:.05pt;mso-width-percent:0;mso-height-percent:0;mso-width-percent:0;mso-height-percent:0" o:hralign="center" o:hrstd="t" o:hr="t"/>
         </w:pict>
       </w:r>
@@ -1606,7 +1600,7 @@
           <w:rFonts w:ascii="Times New Roman" w:hAnsi="Times New Roman" w:cs="Times New Roman"/>
           <w:noProof/>
         </w:rPr>
-        <w:pict w14:anchorId="58DCE606">
+        <w:pict w14:anchorId="670C33E4">
           <v:rect id="_x0000_i1081" alt="" style="width:468pt;height:.05pt;mso-width-percent:0;mso-height-percent:0;mso-width-percent:0;mso-height-percent:0" o:hralign="center" o:hrstd="t" o:hr="t"/>
         </w:pict>
       </w:r>
@@ -2818,7 +2812,7 @@
           <w:rFonts w:ascii="Times New Roman" w:hAnsi="Times New Roman" w:cs="Times New Roman"/>
           <w:noProof/>
         </w:rPr>
-        <w:pict w14:anchorId="0F2ECC73">
+        <w:pict w14:anchorId="14BB8692">
           <v:rect id="_x0000_i1080" alt="" style="width:468pt;height:.05pt;mso-width-percent:0;mso-height-percent:0;mso-width-percent:0;mso-height-percent:0" o:hralign="center" o:hrstd="t" o:hr="t"/>
         </w:pict>
       </w:r>
@@ -3465,7 +3459,7 @@
           <w:rFonts w:ascii="Times New Roman" w:hAnsi="Times New Roman" w:cs="Times New Roman"/>
           <w:noProof/>
         </w:rPr>
-        <w:pict w14:anchorId="3DC51BF0">
+        <w:pict w14:anchorId="55CE7238">
           <v:rect id="_x0000_i1079" alt="" style="width:468pt;height:.05pt;mso-width-percent:0;mso-height-percent:0;mso-width-percent:0;mso-height-percent:0" o:hralign="center" o:hrstd="t" o:hr="t"/>
         </w:pict>
       </w:r>
@@ -4678,7 +4672,7 @@
           <w:rFonts w:ascii="Times New Roman" w:hAnsi="Times New Roman" w:cs="Times New Roman"/>
           <w:noProof/>
         </w:rPr>
-        <w:pict w14:anchorId="7E0424D0">
+        <w:pict w14:anchorId="4A6A1D94">
           <v:rect id="_x0000_i1078" alt="" style="width:468pt;height:.05pt;mso-width-percent:0;mso-height-percent:0;mso-width-percent:0;mso-height-percent:0" o:hralign="center" o:hrstd="t" o:hr="t"/>
         </w:pict>
       </w:r>
@@ -5297,7 +5291,7 @@
           <w:rFonts w:ascii="Times New Roman" w:hAnsi="Times New Roman" w:cs="Times New Roman"/>
           <w:noProof/>
         </w:rPr>
-        <w:pict w14:anchorId="4DEE0DCE">
+        <w:pict w14:anchorId="38B956D2">
           <v:rect id="_x0000_i1077" alt="" style="width:468pt;height:.05pt;mso-width-percent:0;mso-height-percent:0;mso-width-percent:0;mso-height-percent:0" o:hralign="center" o:hrstd="t" o:hr="t"/>
         </w:pict>
       </w:r>
@@ -6168,7 +6162,7 @@
           <w:rFonts w:ascii="Times New Roman" w:hAnsi="Times New Roman" w:cs="Times New Roman"/>
           <w:noProof/>
         </w:rPr>
-        <w:pict w14:anchorId="35769F3E">
+        <w:pict w14:anchorId="0ECC872B">
           <v:rect id="_x0000_i1076" alt="" style="width:468pt;height:.05pt;mso-width-percent:0;mso-height-percent:0;mso-width-percent:0;mso-height-percent:0" o:hralign="center" o:hrstd="t" o:hr="t"/>
         </w:pict>
       </w:r>
@@ -6539,7 +6533,7 @@
           <w:rFonts w:ascii="Times New Roman" w:hAnsi="Times New Roman" w:cs="Times New Roman"/>
           <w:noProof/>
         </w:rPr>
-        <w:pict w14:anchorId="70DF379D">
+        <w:pict w14:anchorId="2C764EC9">
           <v:rect id="_x0000_i1075" alt="" style="width:468pt;height:.05pt;mso-width-percent:0;mso-height-percent:0;mso-width-percent:0;mso-height-percent:0" o:hralign="center" o:hrstd="t" o:hr="t"/>
         </w:pict>
       </w:r>
@@ -6684,7 +6678,7 @@
           <w:rFonts w:ascii="Times New Roman" w:hAnsi="Times New Roman" w:cs="Times New Roman"/>
           <w:noProof/>
         </w:rPr>
-        <w:pict w14:anchorId="204E11F1">
+        <w:pict w14:anchorId="7B151D25">
           <v:rect id="_x0000_i1074" alt="" style="width:468pt;height:.05pt;mso-width-percent:0;mso-height-percent:0;mso-width-percent:0;mso-height-percent:0" o:hralign="center" o:hrstd="t" o:hr="t"/>
         </w:pict>
       </w:r>
@@ -6843,7 +6837,7 @@
           <w:rFonts w:ascii="Times New Roman" w:hAnsi="Times New Roman" w:cs="Times New Roman"/>
           <w:noProof/>
         </w:rPr>
-        <w:pict w14:anchorId="42F87D7C">
+        <w:pict w14:anchorId="4F0FB273">
           <v:rect id="_x0000_i1073" alt="" style="width:468pt;height:.05pt;mso-width-percent:0;mso-height-percent:0;mso-width-percent:0;mso-height-percent:0" o:hralign="center" o:hrstd="t" o:hr="t"/>
         </w:pict>
       </w:r>
@@ -7721,7 +7715,7 @@
           <w:rFonts w:ascii="Times New Roman" w:hAnsi="Times New Roman" w:cs="Times New Roman"/>
           <w:noProof/>
         </w:rPr>
-        <w:pict w14:anchorId="0FB09270">
+        <w:pict w14:anchorId="4DFABB37">
           <v:rect id="_x0000_i1072" alt="" style="width:468pt;height:.05pt;mso-width-percent:0;mso-height-percent:0;mso-width-percent:0;mso-height-percent:0" o:hralign="center" o:hrstd="t" o:hr="t"/>
         </w:pict>
       </w:r>
@@ -8322,7 +8316,7 @@
           <w:rFonts w:ascii="Times New Roman" w:hAnsi="Times New Roman" w:cs="Times New Roman"/>
           <w:noProof/>
         </w:rPr>
-        <w:pict w14:anchorId="6E85B328">
+        <w:pict w14:anchorId="25011EBB">
           <v:rect id="_x0000_i1071" alt="" style="width:468pt;height:.05pt;mso-width-percent:0;mso-height-percent:0;mso-width-percent:0;mso-height-percent:0" o:hralign="center" o:hrstd="t" o:hr="t"/>
         </w:pict>
       </w:r>
@@ -8713,7 +8707,7 @@
           <w:rFonts w:ascii="Times New Roman" w:hAnsi="Times New Roman" w:cs="Times New Roman"/>
           <w:noProof/>
         </w:rPr>
-        <w:pict w14:anchorId="4B497D61">
+        <w:pict w14:anchorId="11C552ED">
           <v:rect id="_x0000_i1070" alt="" style="width:468pt;height:.05pt;mso-width-percent:0;mso-height-percent:0;mso-width-percent:0;mso-height-percent:0" o:hralign="center" o:hrstd="t" o:hr="t"/>
         </w:pict>
       </w:r>
@@ -8835,7 +8829,7 @@
           <w:rFonts w:ascii="Times New Roman" w:hAnsi="Times New Roman" w:cs="Times New Roman"/>
           <w:noProof/>
         </w:rPr>
-        <w:pict w14:anchorId="6E6577C6">
+        <w:pict w14:anchorId="2DD64D2B">
           <v:rect id="_x0000_i1069" alt="" style="width:468pt;height:.05pt;mso-width-percent:0;mso-height-percent:0;mso-width-percent:0;mso-height-percent:0" o:hralign="center" o:hrstd="t" o:hr="t"/>
         </w:pict>
       </w:r>
@@ -9121,7 +9115,7 @@
           <w:rFonts w:ascii="Times New Roman" w:hAnsi="Times New Roman" w:cs="Times New Roman"/>
           <w:noProof/>
         </w:rPr>
-        <w:pict w14:anchorId="35186A90">
+        <w:pict w14:anchorId="16005337">
           <v:rect id="_x0000_i1068" alt="" style="width:468pt;height:.05pt;mso-width-percent:0;mso-height-percent:0;mso-width-percent:0;mso-height-percent:0" o:hralign="center" o:hrstd="t" o:hr="t"/>
         </w:pict>
       </w:r>
@@ -9344,7 +9338,7 @@
           <w:rFonts w:ascii="Times New Roman" w:hAnsi="Times New Roman" w:cs="Times New Roman"/>
           <w:noProof/>
         </w:rPr>
-        <w:pict w14:anchorId="3BD1E101">
+        <w:pict w14:anchorId="3224E86A">
           <v:rect id="_x0000_i1067" alt="" style="width:468pt;height:.05pt;mso-width-percent:0;mso-height-percent:0;mso-width-percent:0;mso-height-percent:0" o:hralign="center" o:hrstd="t" o:hr="t"/>
         </w:pict>
       </w:r>
@@ -11776,7 +11770,7 @@
           <w:rFonts w:ascii="Times New Roman" w:hAnsi="Times New Roman" w:cs="Times New Roman"/>
           <w:noProof/>
         </w:rPr>
-        <w:pict w14:anchorId="1588BD35">
+        <w:pict w14:anchorId="0887E7F2">
           <v:rect id="_x0000_i1066" alt="" style="width:468pt;height:.05pt;mso-width-percent:0;mso-height-percent:0;mso-width-percent:0;mso-height-percent:0" o:hralign="center" o:hrstd="t" o:hr="t"/>
         </w:pict>
       </w:r>
@@ -12219,7 +12213,7 @@
           <w:rFonts w:ascii="Times New Roman" w:hAnsi="Times New Roman" w:cs="Times New Roman"/>
           <w:noProof/>
         </w:rPr>
-        <w:pict w14:anchorId="2D70C504">
+        <w:pict w14:anchorId="037A0B72">
           <v:rect id="_x0000_i1065" alt="" style="width:468pt;height:.05pt;mso-width-percent:0;mso-height-percent:0;mso-width-percent:0;mso-height-percent:0" o:hralign="center" o:hrstd="t" o:hr="t"/>
         </w:pict>
       </w:r>
@@ -13201,7 +13195,7 @@
           <w:rFonts w:ascii="Times New Roman" w:hAnsi="Times New Roman" w:cs="Times New Roman"/>
           <w:noProof/>
         </w:rPr>
-        <w:pict w14:anchorId="333D6B7C">
+        <w:pict w14:anchorId="048F1D9C">
           <v:rect id="_x0000_i1064" alt="" style="width:468pt;height:.05pt;mso-width-percent:0;mso-height-percent:0;mso-width-percent:0;mso-height-percent:0" o:hralign="center" o:hrstd="t" o:hr="t"/>
         </w:pict>
       </w:r>
@@ -13417,7 +13411,7 @@
           <w:rFonts w:ascii="Times New Roman" w:hAnsi="Times New Roman" w:cs="Times New Roman"/>
           <w:noProof/>
         </w:rPr>
-        <w:pict w14:anchorId="79D0CF32">
+        <w:pict w14:anchorId="497CE0F9">
           <v:rect id="_x0000_i1063" alt="" style="width:468pt;height:.05pt;mso-width-percent:0;mso-height-percent:0;mso-width-percent:0;mso-height-percent:0" o:hralign="center" o:hrstd="t" o:hr="t"/>
         </w:pict>
       </w:r>
@@ -13778,7 +13772,7 @@
           <w:rFonts w:ascii="Times New Roman" w:hAnsi="Times New Roman" w:cs="Times New Roman"/>
           <w:noProof/>
         </w:rPr>
-        <w:pict w14:anchorId="21715869">
+        <w:pict w14:anchorId="4F15FD6A">
           <v:rect id="_x0000_i1062" alt="" style="width:468pt;height:.05pt;mso-width-percent:0;mso-height-percent:0;mso-width-percent:0;mso-height-percent:0" o:hralign="center" o:hrstd="t" o:hr="t"/>
         </w:pict>
       </w:r>
@@ -14034,7 +14028,7 @@
           <w:rFonts w:ascii="Times New Roman" w:hAnsi="Times New Roman" w:cs="Times New Roman"/>
           <w:noProof/>
         </w:rPr>
-        <w:pict w14:anchorId="625C15E8">
+        <w:pict w14:anchorId="03E98AE7">
           <v:rect id="_x0000_i1061" alt="" style="width:468pt;height:.05pt;mso-width-percent:0;mso-height-percent:0;mso-width-percent:0;mso-height-percent:0" o:hralign="center" o:hrstd="t" o:hr="t"/>
         </w:pict>
       </w:r>
@@ -14382,7 +14376,7 @@
           <w:rFonts w:ascii="Times New Roman" w:hAnsi="Times New Roman" w:cs="Times New Roman"/>
           <w:noProof/>
         </w:rPr>
-        <w:pict w14:anchorId="15EE7C00">
+        <w:pict w14:anchorId="21158C39">
           <v:rect id="_x0000_i1060" alt="" style="width:468pt;height:.05pt;mso-width-percent:0;mso-height-percent:0;mso-width-percent:0;mso-height-percent:0" o:hralign="center" o:hrstd="t" o:hr="t"/>
         </w:pict>
       </w:r>
@@ -14665,7 +14659,7 @@
           <w:rFonts w:ascii="Times New Roman" w:hAnsi="Times New Roman" w:cs="Times New Roman"/>
           <w:noProof/>
         </w:rPr>
-        <w:pict w14:anchorId="214A8FE7">
+        <w:pict w14:anchorId="24F1B551">
           <v:rect id="_x0000_i1059" alt="" style="width:468pt;height:.05pt;mso-width-percent:0;mso-height-percent:0;mso-width-percent:0;mso-height-percent:0" o:hralign="center" o:hrstd="t" o:hr="t"/>
         </w:pict>
       </w:r>
@@ -15047,7 +15041,7 @@
           <w:rFonts w:ascii="Times New Roman" w:hAnsi="Times New Roman" w:cs="Times New Roman"/>
           <w:noProof/>
         </w:rPr>
-        <w:pict w14:anchorId="631E2359">
+        <w:pict w14:anchorId="69247E7A">
           <v:rect id="_x0000_i1058" alt="" style="width:468pt;height:.05pt;mso-width-percent:0;mso-height-percent:0;mso-width-percent:0;mso-height-percent:0" o:hralign="center" o:hrstd="t" o:hr="t"/>
         </w:pict>
       </w:r>
@@ -15290,7 +15284,7 @@
           <w:rFonts w:ascii="Times New Roman" w:hAnsi="Times New Roman" w:cs="Times New Roman"/>
           <w:noProof/>
         </w:rPr>
-        <w:pict w14:anchorId="18F9ED71">
+        <w:pict w14:anchorId="54A7B9DE">
           <v:rect id="_x0000_i1057" alt="" style="width:468pt;height:.05pt;mso-width-percent:0;mso-height-percent:0;mso-width-percent:0;mso-height-percent:0" o:hralign="center" o:hrstd="t" o:hr="t"/>
         </w:pict>
       </w:r>
@@ -15520,7 +15514,7 @@
           <w:rFonts w:ascii="Times New Roman" w:hAnsi="Times New Roman" w:cs="Times New Roman"/>
           <w:noProof/>
         </w:rPr>
-        <w:pict w14:anchorId="4636BA3D">
+        <w:pict w14:anchorId="322101D4">
           <v:rect id="_x0000_i1056" alt="" style="width:468pt;height:.05pt;mso-width-percent:0;mso-height-percent:0;mso-width-percent:0;mso-height-percent:0" o:hralign="center" o:hrstd="t" o:hr="t"/>
         </w:pict>
       </w:r>
@@ -17033,7 +17027,7 @@
           <w:rFonts w:ascii="Times New Roman" w:hAnsi="Times New Roman" w:cs="Times New Roman"/>
           <w:noProof/>
         </w:rPr>
-        <w:pict w14:anchorId="5B2141EB">
+        <w:pict w14:anchorId="0EEEB906">
           <v:rect id="_x0000_i1055" alt="" style="width:468pt;height:.05pt;mso-width-percent:0;mso-height-percent:0;mso-width-percent:0;mso-height-percent:0" o:hralign="center" o:hrstd="t" o:hr="t"/>
         </w:pict>
       </w:r>
@@ -17225,7 +17219,7 @@
           <w:rFonts w:ascii="Times New Roman" w:hAnsi="Times New Roman" w:cs="Times New Roman"/>
           <w:noProof/>
         </w:rPr>
-        <w:pict w14:anchorId="5079768C">
+        <w:pict w14:anchorId="29DAE747">
           <v:rect id="_x0000_i1054" alt="" style="width:468pt;height:.05pt;mso-width-percent:0;mso-height-percent:0;mso-width-percent:0;mso-height-percent:0" o:hralign="center" o:hrstd="t" o:hr="t"/>
         </w:pict>
       </w:r>
@@ -17296,7 +17290,7 @@
           <w:rFonts w:ascii="Times New Roman" w:hAnsi="Times New Roman" w:cs="Times New Roman"/>
           <w:noProof/>
         </w:rPr>
-        <w:pict w14:anchorId="40F99B65">
+        <w:pict w14:anchorId="3FE28392">
           <v:rect id="_x0000_i1053" alt="" style="width:468pt;height:.05pt;mso-width-percent:0;mso-height-percent:0;mso-width-percent:0;mso-height-percent:0" o:hralign="center" o:hrstd="t" o:hr="t"/>
         </w:pict>
       </w:r>
@@ -17562,7 +17556,7 @@
           <w:rFonts w:ascii="Times New Roman" w:hAnsi="Times New Roman" w:cs="Times New Roman"/>
           <w:noProof/>
         </w:rPr>
-        <w:pict w14:anchorId="1693E93B">
+        <w:pict w14:anchorId="7C807570">
           <v:rect id="_x0000_i1052" alt="" style="width:468pt;height:.05pt;mso-width-percent:0;mso-height-percent:0;mso-width-percent:0;mso-height-percent:0" o:hralign="center" o:hrstd="t" o:hr="t"/>
         </w:pict>
       </w:r>
@@ -17655,7 +17649,7 @@
           <w:rFonts w:ascii="Times New Roman" w:hAnsi="Times New Roman" w:cs="Times New Roman"/>
           <w:noProof/>
         </w:rPr>
-        <w:pict w14:anchorId="217C965D">
+        <w:pict w14:anchorId="1BEE8F06">
           <v:rect id="_x0000_i1051" alt="" style="width:468pt;height:.05pt;mso-width-percent:0;mso-height-percent:0;mso-width-percent:0;mso-height-percent:0" o:hralign="center" o:hrstd="t" o:hr="t"/>
         </w:pict>
       </w:r>
@@ -17937,7 +17931,7 @@
           <w:rFonts w:ascii="Times New Roman" w:hAnsi="Times New Roman" w:cs="Times New Roman"/>
           <w:noProof/>
         </w:rPr>
-        <w:pict w14:anchorId="678F940A">
+        <w:pict w14:anchorId="21C3595C">
           <v:rect id="_x0000_i1050" alt="" style="width:468pt;height:.05pt;mso-width-percent:0;mso-height-percent:0;mso-width-percent:0;mso-height-percent:0" o:hralign="center" o:hrstd="t" o:hr="t"/>
         </w:pict>
       </w:r>
@@ -18047,7 +18041,7 @@
           <w:rFonts w:ascii="Times New Roman" w:hAnsi="Times New Roman" w:cs="Times New Roman"/>
           <w:noProof/>
         </w:rPr>
-        <w:pict w14:anchorId="3BD0F56F">
+        <w:pict w14:anchorId="6F402777">
           <v:rect id="_x0000_i1049" alt="" style="width:468pt;height:.05pt;mso-width-percent:0;mso-height-percent:0;mso-width-percent:0;mso-height-percent:0" o:hralign="center" o:hrstd="t" o:hr="t"/>
         </w:pict>
       </w:r>
@@ -18157,7 +18151,7 @@
           <w:rFonts w:ascii="Times New Roman" w:hAnsi="Times New Roman" w:cs="Times New Roman"/>
           <w:noProof/>
         </w:rPr>
-        <w:pict w14:anchorId="33DA80B6">
+        <w:pict w14:anchorId="111CBEAD">
           <v:rect id="_x0000_i1048" alt="" style="width:468pt;height:.05pt;mso-width-percent:0;mso-height-percent:0;mso-width-percent:0;mso-height-percent:0" o:hralign="center" o:hrstd="t" o:hr="t"/>
         </w:pict>
       </w:r>
@@ -18250,7 +18244,7 @@
           <w:rFonts w:ascii="Times New Roman" w:hAnsi="Times New Roman" w:cs="Times New Roman"/>
           <w:noProof/>
         </w:rPr>
-        <w:pict w14:anchorId="746C76DC">
+        <w:pict w14:anchorId="4F3F0977">
           <v:rect id="_x0000_i1047" alt="" style="width:468pt;height:.05pt;mso-width-percent:0;mso-height-percent:0;mso-width-percent:0;mso-height-percent:0" o:hralign="center" o:hrstd="t" o:hr="t"/>
         </w:pict>
       </w:r>
@@ -18446,7 +18440,7 @@
           <w:rFonts w:ascii="Times New Roman" w:hAnsi="Times New Roman" w:cs="Times New Roman"/>
           <w:noProof/>
         </w:rPr>
-        <w:pict w14:anchorId="3B5551A6">
+        <w:pict w14:anchorId="6DDD2EA3">
           <v:rect id="_x0000_i1046" alt="" style="width:468pt;height:.05pt;mso-width-percent:0;mso-height-percent:0;mso-width-percent:0;mso-height-percent:0" o:hralign="center" o:hrstd="t" o:hr="t"/>
         </w:pict>
       </w:r>
@@ -18539,7 +18533,7 @@
           <w:rFonts w:ascii="Times New Roman" w:hAnsi="Times New Roman" w:cs="Times New Roman"/>
           <w:noProof/>
         </w:rPr>
-        <w:pict w14:anchorId="414C945C">
+        <w:pict w14:anchorId="7FE3722F">
           <v:rect id="_x0000_i1045" alt="" style="width:468pt;height:.05pt;mso-width-percent:0;mso-height-percent:0;mso-width-percent:0;mso-height-percent:0" o:hralign="center" o:hrstd="t" o:hr="t"/>
         </w:pict>
       </w:r>
@@ -18794,7 +18788,7 @@
           <w:rFonts w:ascii="Times New Roman" w:hAnsi="Times New Roman" w:cs="Times New Roman"/>
           <w:noProof/>
         </w:rPr>
-        <w:pict w14:anchorId="24C7D6FD">
+        <w:pict w14:anchorId="337684B1">
           <v:rect id="_x0000_i1044" alt="" style="width:468pt;height:.05pt;mso-width-percent:0;mso-height-percent:0;mso-width-percent:0;mso-height-percent:0" o:hralign="center" o:hrstd="t" o:hr="t"/>
         </w:pict>
       </w:r>
@@ -18888,7 +18882,7 @@
           <w:noProof/>
         </w:rPr>
         <w:lastRenderedPageBreak/>
-        <w:pict w14:anchorId="138D3E8C">
+        <w:pict w14:anchorId="4F404BDE">
           <v:rect id="_x0000_i1043" alt="" style="width:468pt;height:.05pt;mso-width-percent:0;mso-height-percent:0;mso-width-percent:0;mso-height-percent:0" o:hralign="center" o:hrstd="t" o:hr="t"/>
         </w:pict>
       </w:r>
@@ -18981,7 +18975,7 @@
           <w:rFonts w:ascii="Times New Roman" w:hAnsi="Times New Roman" w:cs="Times New Roman"/>
           <w:noProof/>
         </w:rPr>
-        <w:pict w14:anchorId="3A392503">
+        <w:pict w14:anchorId="4A3A6CF4">
           <v:rect id="_x0000_i1042" alt="" style="width:468pt;height:.05pt;mso-width-percent:0;mso-height-percent:0;mso-width-percent:0;mso-height-percent:0" o:hralign="center" o:hrstd="t" o:hr="t"/>
         </w:pict>
       </w:r>
@@ -19091,7 +19085,7 @@
           <w:rFonts w:ascii="Times New Roman" w:hAnsi="Times New Roman" w:cs="Times New Roman"/>
           <w:noProof/>
         </w:rPr>
-        <w:pict w14:anchorId="7FE5DC6F">
+        <w:pict w14:anchorId="0AB91CF9">
           <v:rect id="_x0000_i1041" alt="" style="width:468pt;height:.05pt;mso-width-percent:0;mso-height-percent:0;mso-width-percent:0;mso-height-percent:0" o:hralign="center" o:hrstd="t" o:hr="t"/>
         </w:pict>
       </w:r>
@@ -19289,7 +19283,7 @@
           <w:rFonts w:ascii="Times New Roman" w:hAnsi="Times New Roman" w:cs="Times New Roman"/>
           <w:noProof/>
         </w:rPr>
-        <w:pict w14:anchorId="1BDA7C0A">
+        <w:pict w14:anchorId="2E63D9FF">
           <v:rect id="_x0000_i1040" alt="" style="width:468pt;height:.05pt;mso-width-percent:0;mso-height-percent:0;mso-width-percent:0;mso-height-percent:0" o:hralign="center" o:hrstd="t" o:hr="t"/>
         </w:pict>
       </w:r>
@@ -19400,7 +19394,7 @@
           <w:noProof/>
         </w:rPr>
         <w:lastRenderedPageBreak/>
-        <w:pict w14:anchorId="66FEFCA1">
+        <w:pict w14:anchorId="2E7B07B4">
           <v:rect id="_x0000_i1039" alt="" style="width:468pt;height:.05pt;mso-width-percent:0;mso-height-percent:0;mso-width-percent:0;mso-height-percent:0" o:hralign="center" o:hrstd="t" o:hr="t"/>
         </w:pict>
       </w:r>
@@ -19493,7 +19487,7 @@
           <w:rFonts w:ascii="Times New Roman" w:hAnsi="Times New Roman" w:cs="Times New Roman"/>
           <w:noProof/>
         </w:rPr>
-        <w:pict w14:anchorId="1AE37E93">
+        <w:pict w14:anchorId="649C2599">
           <v:rect id="_x0000_i1038" alt="" style="width:468pt;height:.05pt;mso-width-percent:0;mso-height-percent:0;mso-width-percent:0;mso-height-percent:0" o:hralign="center" o:hrstd="t" o:hr="t"/>
         </w:pict>
       </w:r>
@@ -21209,7 +21203,7 @@
           <w:rFonts w:ascii="Times New Roman" w:hAnsi="Times New Roman" w:cs="Times New Roman"/>
           <w:noProof/>
         </w:rPr>
-        <w:pict w14:anchorId="7998099C">
+        <w:pict w14:anchorId="7CC612E7">
           <v:rect id="_x0000_i1037" alt="" style="width:468pt;height:.05pt;mso-width-percent:0;mso-height-percent:0;mso-width-percent:0;mso-height-percent:0" o:hralign="center" o:hrstd="t" o:hr="t"/>
         </w:pict>
       </w:r>
@@ -23205,7 +23199,7 @@
           <w:rFonts w:ascii="Times New Roman" w:hAnsi="Times New Roman" w:cs="Times New Roman"/>
           <w:noProof/>
         </w:rPr>
-        <w:pict w14:anchorId="330E11E7">
+        <w:pict w14:anchorId="5A84C142">
           <v:rect id="_x0000_i1036" alt="" style="width:468pt;height:.05pt;mso-width-percent:0;mso-height-percent:0;mso-width-percent:0;mso-height-percent:0" o:hralign="center" o:hrstd="t" o:hr="t"/>
         </w:pict>
       </w:r>
@@ -28187,7 +28181,7 @@
           <w:rFonts w:ascii="Times New Roman" w:hAnsi="Times New Roman" w:cs="Times New Roman"/>
           <w:noProof/>
         </w:rPr>
-        <w:pict w14:anchorId="0DA7EE61">
+        <w:pict w14:anchorId="597A1B5F">
           <v:rect id="_x0000_i1035" alt="" style="width:468pt;height:.05pt;mso-width-percent:0;mso-height-percent:0;mso-width-percent:0;mso-height-percent:0" o:hralign="center" o:hrstd="t" o:hr="t"/>
         </w:pict>
       </w:r>
@@ -30049,7 +30043,7 @@
           <w:rFonts w:ascii="Times New Roman" w:hAnsi="Times New Roman" w:cs="Times New Roman"/>
           <w:noProof/>
         </w:rPr>
-        <w:pict w14:anchorId="40DD6C4D">
+        <w:pict w14:anchorId="36687BB3">
           <v:rect id="_x0000_i1034" alt="" style="width:468pt;height:.05pt;mso-width-percent:0;mso-height-percent:0;mso-width-percent:0;mso-height-percent:0" o:hralign="center" o:hrstd="t" o:hr="t"/>
         </w:pict>
       </w:r>
@@ -30744,7 +30738,7 @@
           <w:rFonts w:ascii="Times New Roman" w:hAnsi="Times New Roman" w:cs="Times New Roman"/>
           <w:noProof/>
         </w:rPr>
-        <w:pict w14:anchorId="1308B317">
+        <w:pict w14:anchorId="68ABDDDD">
           <v:rect id="_x0000_i1033" alt="" style="width:468pt;height:.05pt;mso-width-percent:0;mso-height-percent:0;mso-width-percent:0;mso-height-percent:0" o:hralign="center" o:hrstd="t" o:hr="t"/>
         </w:pict>
       </w:r>
@@ -30943,7 +30937,7 @@
           <w:rFonts w:ascii="Times New Roman" w:hAnsi="Times New Roman" w:cs="Times New Roman"/>
           <w:noProof/>
         </w:rPr>
-        <w:pict w14:anchorId="61692249">
+        <w:pict w14:anchorId="26A51B7B">
           <v:rect id="_x0000_i1032" alt="" style="width:468pt;height:.05pt;mso-width-percent:0;mso-height-percent:0;mso-width-percent:0;mso-height-percent:0" o:hralign="center" o:hrstd="t" o:hr="t"/>
         </w:pict>
       </w:r>
@@ -31142,7 +31136,7 @@
           <w:rFonts w:ascii="Times New Roman" w:hAnsi="Times New Roman" w:cs="Times New Roman"/>
           <w:noProof/>
         </w:rPr>
-        <w:pict w14:anchorId="7DA01C9B">
+        <w:pict w14:anchorId="3BA67C86">
           <v:rect id="_x0000_i1031" alt="" style="width:468pt;height:.05pt;mso-width-percent:0;mso-height-percent:0;mso-width-percent:0;mso-height-percent:0" o:hralign="center" o:hrstd="t" o:hr="t"/>
         </w:pict>
       </w:r>
@@ -31791,7 +31785,7 @@
           <w:rFonts w:ascii="Times New Roman" w:hAnsi="Times New Roman" w:cs="Times New Roman"/>
           <w:noProof/>
         </w:rPr>
-        <w:pict w14:anchorId="254A6E36">
+        <w:pict w14:anchorId="475D3CDC">
           <v:rect id="_x0000_i1030" alt="" style="width:468pt;height:.05pt;mso-width-percent:0;mso-height-percent:0;mso-width-percent:0;mso-height-percent:0" o:hralign="center" o:hrstd="t" o:hr="t"/>
         </w:pict>
       </w:r>
@@ -32164,7 +32158,7 @@
           <w:rFonts w:ascii="Times New Roman" w:hAnsi="Times New Roman" w:cs="Times New Roman"/>
           <w:noProof/>
         </w:rPr>
-        <w:pict w14:anchorId="76DB1061">
+        <w:pict w14:anchorId="6D2F70F3">
           <v:rect id="_x0000_i1029" alt="" style="width:468pt;height:.05pt;mso-width-percent:0;mso-height-percent:0;mso-width-percent:0;mso-height-percent:0" o:hralign="center" o:hrstd="t" o:hr="t"/>
         </w:pict>
       </w:r>
@@ -32704,7 +32698,7 @@
           <w:rFonts w:ascii="Times New Roman" w:hAnsi="Times New Roman" w:cs="Times New Roman"/>
           <w:noProof/>
         </w:rPr>
-        <w:pict w14:anchorId="04B00AE2">
+        <w:pict w14:anchorId="7686A809">
           <v:rect id="_x0000_i1028" alt="" style="width:468pt;height:.05pt;mso-width-percent:0;mso-height-percent:0;mso-width-percent:0;mso-height-percent:0" o:hralign="center" o:hrstd="t" o:hr="t"/>
         </w:pict>
       </w:r>
@@ -32952,7 +32946,7 @@
           <w:rFonts w:ascii="Times New Roman" w:hAnsi="Times New Roman" w:cs="Times New Roman"/>
           <w:noProof/>
         </w:rPr>
-        <w:pict w14:anchorId="62E9CD1D">
+        <w:pict w14:anchorId="6856BD9B">
           <v:rect id="_x0000_i1027" alt="" style="width:468pt;height:.05pt;mso-width-percent:0;mso-height-percent:0;mso-width-percent:0;mso-height-percent:0" o:hralign="center" o:hrstd="t" o:hr="t"/>
         </w:pict>
       </w:r>
@@ -33241,7 +33235,7 @@
           <w:rFonts w:ascii="Times New Roman" w:hAnsi="Times New Roman" w:cs="Times New Roman"/>
           <w:noProof/>
         </w:rPr>
-        <w:pict w14:anchorId="688B1AAB">
+        <w:pict w14:anchorId="195B1AD4">
           <v:rect id="_x0000_i1026" alt="" style="width:468pt;height:.05pt;mso-width-percent:0;mso-height-percent:0;mso-width-percent:0;mso-height-percent:0" o:hralign="center" o:hrstd="t" o:hr="t"/>
         </w:pict>
       </w:r>
@@ -33362,7 +33356,7 @@
           <w:rFonts w:ascii="Times New Roman" w:hAnsi="Times New Roman" w:cs="Times New Roman"/>
           <w:noProof/>
         </w:rPr>
-        <w:pict w14:anchorId="1F42B874">
+        <w:pict w14:anchorId="04AFC13B">
           <v:rect id="_x0000_i1025" alt="" style="width:468pt;height:.05pt;mso-width-percent:0;mso-height-percent:0;mso-width-percent:0;mso-height-percent:0" o:hralign="center" o:hrstd="t" o:hr="t"/>
         </w:pict>
       </w:r>

</xml_diff>